<commit_message>
docs(certification): annexes Bloc 3, Gantt et correction du planning (début 09/03)
- Annexes A-E (planning détaillé, RACI, grille de compétences, cas d'arbitrage,
  plan RSE) + diagramme de Gantt généré (scripts/bloc3_gantt.py)
- Planning corrigé : projet démarré le 9 mars 2026 (runs admin.pipeline_run
  3-6 de mars à mai), Git à partir de juin ; durée ~5 mois au lieu de 8 semaines
- Correction faute (résilience réseau)
</commit_message>
<xml_diff>
--- a/docs/certification/BLOC3_Elaborer_Piloter_Projet.docx
+++ b/docs/certification/BLOC3_Elaborer_Piloter_Projet.docx
@@ -965,7 +965,7 @@
           <w:p>
             <w:r/>
             <w:r>
-              <w:t>~2 mois-homme (juin-juillet 2026)</w:t>
+              <w:t>~5 mois calendaires (09/03 → fin 07/2026), à temps partiel</w:t>
             </w:r>
           </w:p>
         </w:tc>
@@ -1098,16 +1098,16 @@
         <w:t>humain</w:t>
       </w:r>
       <w:r>
-        <w:t xml:space="preserve"> : ~2 mois-homme, l'infrastructure étant open-source et locale (coût marginal). Pour un déploiement client, le chiffrage indicatif : ~4-6 mois-équipe + une infrastructure d'hébergement modeste (le modèle de production LinearSVC pèse quelques Mo, pas d'exigence GPU en inférence batch). </w:t>
+        <w:t xml:space="preserve">, l'infrastructure étant open-source et locale (coût marginal). Pour un déploiement client, le chiffrage indicatif : ~4-6 mois-équipe + une infrastructure d'hébergement modeste (le modèle de production LinearSVC pèse quelques Mo, pas d'exigence GPU en inférence batch). </w:t>
       </w:r>
       <w:r>
         <w:rPr>
           <w:b/>
         </w:rPr>
-        <w:t>Délai réalisé du prototype : 8 semaines</w:t>
-      </w:r>
-      <w:r>
-        <w:t xml:space="preserve"> (2 juin → fin juillet 2026).</w:t>
+        <w:t>Délai réalisé du prototype : ~5 mois</w:t>
+      </w:r>
+      <w:r>
+        <w:t xml:space="preserve"> (09/03 → fin 07/2026), en travail à temps partiel.</w:t>
       </w:r>
     </w:p>
     <w:p>
@@ -1204,7 +1204,7 @@
           <w:i/>
           <w:color w:val="4B5563"/>
         </w:rPr>
-        <w:t xml:space="preserve"> (~2 mois-homme réalisés en 8 semaines ; ~4-6 mois-équipe pour l'industrialisation) et </w:t>
+        <w:t xml:space="preserve"> (~5 mois calendaires à temps partiel ; ~4-6 mois-équipe pour l'industrialisation) et </w:t>
       </w:r>
       <w:r>
         <w:rPr>
@@ -1708,7 +1708,7 @@
         <w:t>tableau Kanban</w:t>
       </w:r>
       <w:r>
-        <w:t xml:space="preserve"> jalonné par les échéances de certification, cohérent avec la méthodologie (flux + jalons), et matérialisé dans le suivi Git.</w:t>
+        <w:t xml:space="preserve"> jalonné par les échéances de certification, cohérent avec la méthodologie (flux + jalons), et matérialisé dans le suivi (runs pipeline en amont, historique Git à partir de juin).</w:t>
       </w:r>
     </w:p>
     <w:p>
@@ -1716,12 +1716,21 @@
         <w:pStyle w:val="Heading4"/>
       </w:pPr>
       <w:r>
-        <w:t>Découpage en phases (planning réel, issu de l'historique Git)</w:t>
+        <w:t>Découpage en phases (planning réel)</w:t>
       </w:r>
     </w:p>
     <w:p>
       <w:r>
-        <w:t xml:space="preserve">Le planning ci-dessous est </w:t>
+        <w:t xml:space="preserve">Le projet a </w:t>
+      </w:r>
+      <w:r>
+        <w:rPr>
+          <w:b/>
+        </w:rPr>
+        <w:t>débuté le 9 mars 2026</w:t>
+      </w:r>
+      <w:r>
+        <w:t xml:space="preserve">. Le planning ci-dessous est </w:t>
       </w:r>
       <w:r>
         <w:rPr>
@@ -1730,7 +1739,7 @@
         <w:t>authentique</w:t>
       </w:r>
       <w:r>
-        <w:t xml:space="preserve"> : il est reconstruit à partir des dates de commits réelles.</w:t>
+        <w:t xml:space="preserve"> : les premières phases sont datées par les runs réels journalisés dans `admin.pipeline_run`, les suivantes par l'historique Git (le dépôt ayant été formalisé en juin).</w:t>
       </w:r>
     </w:p>
     <w:tbl>
@@ -1741,14 +1750,15 @@
         <w:tblLook w:firstColumn="1" w:firstRow="1" w:lastColumn="0" w:lastRow="0" w:noHBand="0" w:noVBand="1" w:val="04A0"/>
       </w:tblPr>
       <w:tblGrid>
-        <w:gridCol w:w="2880"/>
-        <w:gridCol w:w="2880"/>
-        <w:gridCol w:w="2880"/>
+        <w:gridCol w:w="2160"/>
+        <w:gridCol w:w="2160"/>
+        <w:gridCol w:w="2160"/>
+        <w:gridCol w:w="2160"/>
       </w:tblGrid>
       <w:tr>
         <w:tc>
           <w:tcPr>
-            <w:tcW w:type="dxa" w:w="2880"/>
+            <w:tcW w:type="dxa" w:w="2160"/>
           </w:tcPr>
           <w:p>
             <w:r>
@@ -1766,7 +1776,7 @@
         </w:tc>
         <w:tc>
           <w:tcPr>
-            <w:tcW w:type="dxa" w:w="2880"/>
+            <w:tcW w:type="dxa" w:w="2160"/>
           </w:tcPr>
           <w:p>
             <w:r>
@@ -1784,7 +1794,7 @@
         </w:tc>
         <w:tc>
           <w:tcPr>
-            <w:tcW w:type="dxa" w:w="2880"/>
+            <w:tcW w:type="dxa" w:w="2160"/>
           </w:tcPr>
           <w:p>
             <w:r>
@@ -1800,11 +1810,29 @@
             </w:r>
           </w:p>
         </w:tc>
+        <w:tc>
+          <w:tcPr>
+            <w:tcW w:type="dxa" w:w="2160"/>
+          </w:tcPr>
+          <w:p>
+            <w:r>
+              <w:rPr>
+                <w:b/>
+              </w:rPr>
+            </w:r>
+            <w:r>
+              <w:rPr>
+                <w:b/>
+              </w:rPr>
+              <w:t>Jalons réels</w:t>
+            </w:r>
+          </w:p>
+        </w:tc>
       </w:tr>
       <w:tr>
         <w:tc>
           <w:tcPr>
-            <w:tcW w:type="dxa" w:w="2880"/>
+            <w:tcW w:type="dxa" w:w="2160"/>
           </w:tcPr>
           <w:p>
             <w:r/>
@@ -1812,29 +1840,40 @@
               <w:rPr>
                 <w:b/>
               </w:rPr>
-              <w:t>P0 — Socle &amp; collecte</w:t>
+              <w:t>P0 — Cadrage &amp; collecte</w:t>
             </w:r>
           </w:p>
         </w:tc>
         <w:tc>
           <w:tcPr>
-            <w:tcW w:type="dxa" w:w="2880"/>
+            <w:tcW w:type="dxa" w:w="2160"/>
           </w:tcPr>
           <w:p>
             <w:r/>
             <w:r>
-              <w:t>02/06</w:t>
+              <w:t>09/03 → 31/03</w:t>
             </w:r>
           </w:p>
         </w:tc>
         <w:tc>
           <w:tcPr>
-            <w:tcW w:type="dxa" w:w="2880"/>
+            <w:tcW w:type="dxa" w:w="2160"/>
           </w:tcPr>
           <w:p>
             <w:r/>
             <w:r>
-              <w:t>Pipeline initial, collecte Oracle, socle de tests, récit honnête</w:t>
+              <w:t>Connexion Oracle, extraction des métadonnées, premiers cycles</w:t>
+            </w:r>
+          </w:p>
+        </w:tc>
+        <w:tc>
+          <w:tcPr>
+            <w:tcW w:type="dxa" w:w="2160"/>
+          </w:tcPr>
+          <w:p>
+            <w:r/>
+            <w:r>
+              <w:t>runs 3 (13/03) et 4 (23/03)</w:t>
             </w:r>
           </w:p>
         </w:tc>
@@ -1842,7 +1881,7 @@
       <w:tr>
         <w:tc>
           <w:tcPr>
-            <w:tcW w:type="dxa" w:w="2880"/>
+            <w:tcW w:type="dxa" w:w="2160"/>
           </w:tcPr>
           <w:p>
             <w:r/>
@@ -1850,29 +1889,40 @@
               <w:rPr>
                 <w:b/>
               </w:rPr>
-              <w:t>P1 — Analyse &amp; valorisation</w:t>
+              <w:t>P1 — Modélisation &amp; analyse</w:t>
             </w:r>
           </w:p>
         </w:tc>
         <w:tc>
           <w:tcPr>
-            <w:tcW w:type="dxa" w:w="2880"/>
+            <w:tcW w:type="dxa" w:w="2160"/>
           </w:tcPr>
           <w:p>
             <w:r/>
             <w:r>
-              <w:t>03/06</w:t>
+              <w:t>04 → 05</w:t>
             </w:r>
           </w:p>
         </w:tc>
         <w:tc>
           <w:tcPr>
-            <w:tcW w:type="dxa" w:w="2880"/>
+            <w:tcW w:type="dxa" w:w="2160"/>
           </w:tcPr>
           <w:p>
             <w:r/>
             <w:r>
-              <w:t>Comparaison N-1, ROI Monte-Carlo (E2/E3)</w:t>
+              <w:t>Modèle en étoile, classification, comparaison N-1, ROI Monte-Carlo</w:t>
+            </w:r>
+          </w:p>
+        </w:tc>
+        <w:tc>
+          <w:tcPr>
+            <w:tcW w:type="dxa" w:w="2160"/>
+          </w:tcPr>
+          <w:p>
+            <w:r/>
+            <w:r>
+              <w:t>runs 5 (22/04) et 6 (31/05)</w:t>
             </w:r>
           </w:p>
         </w:tc>
@@ -1880,7 +1930,7 @@
       <w:tr>
         <w:tc>
           <w:tcPr>
-            <w:tcW w:type="dxa" w:w="2880"/>
+            <w:tcW w:type="dxa" w:w="2160"/>
           </w:tcPr>
           <w:p>
             <w:r/>
@@ -1894,18 +1944,18 @@
         </w:tc>
         <w:tc>
           <w:tcPr>
-            <w:tcW w:type="dxa" w:w="2880"/>
+            <w:tcW w:type="dxa" w:w="2160"/>
           </w:tcPr>
           <w:p>
             <w:r/>
             <w:r>
-              <w:t>05/06</w:t>
+              <w:t>début 06</w:t>
             </w:r>
           </w:p>
         </w:tc>
         <w:tc>
           <w:tcPr>
-            <w:tcW w:type="dxa" w:w="2880"/>
+            <w:tcW w:type="dxa" w:w="2160"/>
           </w:tcPr>
           <w:p>
             <w:r/>
@@ -1914,11 +1964,22 @@
             </w:r>
           </w:p>
         </w:tc>
+        <w:tc>
+          <w:tcPr>
+            <w:tcW w:type="dxa" w:w="2160"/>
+          </w:tcPr>
+          <w:p>
+            <w:r/>
+            <w:r>
+              <w:t>commits `phase0`, `phase1`</w:t>
+            </w:r>
+          </w:p>
+        </w:tc>
       </w:tr>
       <w:tr>
         <w:tc>
           <w:tcPr>
-            <w:tcW w:type="dxa" w:w="2880"/>
+            <w:tcW w:type="dxa" w:w="2160"/>
           </w:tcPr>
           <w:p>
             <w:r/>
@@ -1932,18 +1993,18 @@
         </w:tc>
         <w:tc>
           <w:tcPr>
-            <w:tcW w:type="dxa" w:w="2880"/>
+            <w:tcW w:type="dxa" w:w="2160"/>
           </w:tcPr>
           <w:p>
             <w:r/>
             <w:r>
-              <w:t>19/06</w:t>
+              <w:t>09-19/06</w:t>
             </w:r>
           </w:p>
         </w:tc>
         <w:tc>
           <w:tcPr>
-            <w:tcW w:type="dxa" w:w="2880"/>
+            <w:tcW w:type="dxa" w:w="2160"/>
           </w:tcPr>
           <w:p>
             <w:r/>
@@ -1952,11 +2013,22 @@
             </w:r>
           </w:p>
         </w:tc>
+        <w:tc>
+          <w:tcPr>
+            <w:tcW w:type="dxa" w:w="2160"/>
+          </w:tcPr>
+          <w:p>
+            <w:r/>
+            <w:r>
+              <w:t>commits `xlmr`</w:t>
+            </w:r>
+          </w:p>
+        </w:tc>
       </w:tr>
       <w:tr>
         <w:tc>
           <w:tcPr>
-            <w:tcW w:type="dxa" w:w="2880"/>
+            <w:tcW w:type="dxa" w:w="2160"/>
           </w:tcPr>
           <w:p>
             <w:r/>
@@ -1970,18 +2042,18 @@
         </w:tc>
         <w:tc>
           <w:tcPr>
-            <w:tcW w:type="dxa" w:w="2880"/>
+            <w:tcW w:type="dxa" w:w="2160"/>
           </w:tcPr>
           <w:p>
             <w:r/>
             <w:r>
-              <w:t>17/07</w:t>
+              <w:t>07-17/07</w:t>
             </w:r>
           </w:p>
         </w:tc>
         <w:tc>
           <w:tcPr>
-            <w:tcW w:type="dxa" w:w="2880"/>
+            <w:tcW w:type="dxa" w:w="2160"/>
           </w:tcPr>
           <w:p>
             <w:r/>
@@ -1990,11 +2062,22 @@
             </w:r>
           </w:p>
         </w:tc>
+        <w:tc>
+          <w:tcPr>
+            <w:tcW w:type="dxa" w:w="2160"/>
+          </w:tcPr>
+          <w:p>
+            <w:r/>
+            <w:r>
+              <w:t>commits `extract`, `security`</w:t>
+            </w:r>
+          </w:p>
+        </w:tc>
       </w:tr>
       <w:tr>
         <w:tc>
           <w:tcPr>
-            <w:tcW w:type="dxa" w:w="2880"/>
+            <w:tcW w:type="dxa" w:w="2160"/>
           </w:tcPr>
           <w:p>
             <w:r/>
@@ -2008,23 +2091,34 @@
         </w:tc>
         <w:tc>
           <w:tcPr>
-            <w:tcW w:type="dxa" w:w="2880"/>
+            <w:tcW w:type="dxa" w:w="2160"/>
           </w:tcPr>
           <w:p>
             <w:r/>
             <w:r>
-              <w:t>07-08/26</w:t>
+              <w:t>14/07 → 08/26</w:t>
             </w:r>
           </w:p>
         </w:tc>
         <w:tc>
           <w:tcPr>
-            <w:tcW w:type="dxa" w:w="2880"/>
+            <w:tcW w:type="dxa" w:w="2160"/>
           </w:tcPr>
           <w:p>
             <w:r/>
             <w:r>
-              <w:t>Dossiers Bloc 1, 2, 3, 5</w:t>
+              <w:t>Dossiers Blocs 1, 2, 3, 5</w:t>
+            </w:r>
+          </w:p>
+        </w:tc>
+        <w:tc>
+          <w:tcPr>
+            <w:tcW w:type="dxa" w:w="2160"/>
+          </w:tcPr>
+          <w:p>
+            <w:r/>
+            <w:r>
+              <w:t>commits `docs(certification)`</w:t>
             </w:r>
           </w:p>
         </w:tc>
@@ -2568,7 +2662,7 @@
         <w:t>Chemin critique</w:t>
       </w:r>
       <w:r>
-        <w:t xml:space="preserve"> : la disponibilité du VPN conditionne toute extraction Oracle — un blocage réseau gèle la collecte. Mesure : résilience réséau (retry, keepalive) et découplage (la couche analytique se recalcule sans VPN).</w:t>
+        <w:t xml:space="preserve"> : la disponibilité du VPN conditionne toute extraction Oracle — un blocage réseau gèle la collecte. Mesure : résilience réseau (retry, keepalive) et découplage (la couche analytique se recalcule sans VPN).</w:t>
       </w:r>
     </w:p>
     <w:p>
@@ -2648,7 +2742,7 @@
           <w:i/>
           <w:color w:val="4B5563"/>
         </w:rPr>
-        <w:t xml:space="preserve"> (P0→P5, dates Git réelles) et </w:t>
+        <w:t xml:space="preserve"> (P0→P5, dates réelles issues des runs pipeline puis de l'historique Git) et </w:t>
       </w:r>
       <w:r>
         <w:rPr>
@@ -2757,10 +2851,19 @@
         <w:rPr>
           <w:b/>
         </w:rPr>
-        <w:t>Git</w:t>
-      </w:r>
-      <w:r>
-        <w:t xml:space="preserve"> — journal exhaustif de l'avancement (27 commits datés, messages structurés `feat/fix/docs`), qui matérialise le flux Kanban (chaque commit = une carte terminée).</w:t>
+        <w:t>`admin.pipeline_run`</w:t>
+      </w:r>
+      <w:r>
+        <w:t xml:space="preserve"> — table de traçabilité des exécutions (run_id, flow, statut `success`/`failed`, horodatages) : c'est le suivi des </w:t>
+      </w:r>
+      <w:r>
+        <w:rPr>
+          <w:b/>
+        </w:rPr>
+        <w:t>phases amont</w:t>
+      </w:r>
+      <w:r>
+        <w:t xml:space="preserve"> (mars-mai), avant la formalisation du dépôt.</w:t>
       </w:r>
     </w:p>
     <w:p>
@@ -2771,10 +2874,10 @@
         <w:rPr>
           <w:b/>
         </w:rPr>
-        <w:t>`admin.pipeline_run`</w:t>
-      </w:r>
-      <w:r>
-        <w:t xml:space="preserve"> — table de traçabilité des exécutions du pipeline (run_id, flow, statut `success`/`failed`, horodatages début/fin) : suivi opérationnel des traitements.</w:t>
+        <w:t>Git</w:t>
+      </w:r>
+      <w:r>
+        <w:t xml:space="preserve"> — journal de l'avancement à partir de juin (commits datés, messages structurés `feat/fix/docs`), qui matérialise le flux Kanban (chaque commit = une carte terminée).</w:t>
       </w:r>
     </w:p>
     <w:p>
@@ -2875,7 +2978,7 @@
           <w:p>
             <w:r/>
             <w:r>
-              <w:t>Nb de commits / phase</w:t>
+              <w:t>Jalons atteints / phase (runs, commits)</w:t>
             </w:r>
           </w:p>
         </w:tc>
@@ -5685,10 +5788,10 @@
         <w:rPr>
           <w:b/>
         </w:rPr>
-        <w:t>réel issu de l'historique Git</w:t>
-      </w:r>
-      <w:r>
-        <w:t xml:space="preserve"> (6 phases), matrice RACI pour le déploiement, et un suivi outillé (Git + `pipeline_run` + dashboard) avec indicateurs argumentés.</w:t>
+        <w:t>réel</w:t>
+      </w:r>
+      <w:r>
+        <w:t xml:space="preserve"> (6 phases, du 09/03 au 29/08), matrice RACI pour le déploiement, et un suivi outillé (Git + `pipeline_run` + dashboard) avec indicateurs argumentés.</w:t>
       </w:r>
     </w:p>
     <w:p>
@@ -5770,7 +5873,7 @@
         <w:t>A. Planning détaillé</w:t>
       </w:r>
       <w:r>
-        <w:t xml:space="preserve"> : phases P0→P5 avec commits Git de référence.</w:t>
+        <w:t xml:space="preserve"> : phases P0→P5 avec jalons réels (runs pipeline + commits Git) et diagramme de Gantt.</w:t>
       </w:r>
     </w:p>
     <w:p>

</xml_diff>